<commit_message>
contexto de los datos
</commit_message>
<xml_diff>
--- a/INFORME.docx
+++ b/INFORME.docx
@@ -4,53 +4,443 @@
   <w:body>
     <w:p>
       <w:r>
-        <w:t>INFORME</w:t>
-      </w:r>
-      <w:r>
-        <w:t xml:space="preserve"> DE CODIFICACIÓN DE BASE DE DATOS DE CUMPLIMIENTO IMPUESTO PREDIAL 2007 A 2023 DE BOGOTÁ D.C.</w:t>
+        <w:rPr>
+          <w:noProof/>
+        </w:rPr>
+        <w:drawing>
+          <wp:anchor distT="0" distB="0" distL="114300" distR="114300" simplePos="0" relativeHeight="251658240" behindDoc="0" locked="0" layoutInCell="1" allowOverlap="1" wp14:anchorId="2B16CF6A" wp14:editId="176B7375">
+            <wp:simplePos x="0" y="0"/>
+            <wp:positionH relativeFrom="margin">
+              <wp:align>left</wp:align>
+            </wp:positionH>
+            <wp:positionV relativeFrom="paragraph">
+              <wp:posOffset>189865</wp:posOffset>
+            </wp:positionV>
+            <wp:extent cx="1123950" cy="1045210"/>
+            <wp:effectExtent l="0" t="0" r="0" b="2540"/>
+            <wp:wrapThrough wrapText="bothSides">
+              <wp:wrapPolygon edited="0">
+                <wp:start x="0" y="0"/>
+                <wp:lineTo x="0" y="21259"/>
+                <wp:lineTo x="21234" y="21259"/>
+                <wp:lineTo x="21234" y="0"/>
+                <wp:lineTo x="0" y="0"/>
+              </wp:wrapPolygon>
+            </wp:wrapThrough>
+            <wp:docPr id="903884636" name="Imagen 2"/>
+            <wp:cNvGraphicFramePr>
+              <a:graphicFrameLocks xmlns:a="http://schemas.openxmlformats.org/drawingml/2006/main" noChangeAspect="1"/>
+            </wp:cNvGraphicFramePr>
+            <a:graphic xmlns:a="http://schemas.openxmlformats.org/drawingml/2006/main">
+              <a:graphicData uri="http://schemas.openxmlformats.org/drawingml/2006/picture">
+                <pic:pic xmlns:pic="http://schemas.openxmlformats.org/drawingml/2006/picture">
+                  <pic:nvPicPr>
+                    <pic:cNvPr id="0" name="Picture 3"/>
+                    <pic:cNvPicPr>
+                      <a:picLocks noChangeAspect="1" noChangeArrowheads="1"/>
+                    </pic:cNvPicPr>
+                  </pic:nvPicPr>
+                  <pic:blipFill>
+                    <a:blip r:embed="rId5" cstate="print">
+                      <a:extLst>
+                        <a:ext uri="{28A0092B-C50C-407E-A947-70E740481C1C}">
+                          <a14:useLocalDpi xmlns:a14="http://schemas.microsoft.com/office/drawing/2010/main" val="0"/>
+                        </a:ext>
+                      </a:extLst>
+                    </a:blip>
+                    <a:srcRect/>
+                    <a:stretch>
+                      <a:fillRect/>
+                    </a:stretch>
+                  </pic:blipFill>
+                  <pic:spPr bwMode="auto">
+                    <a:xfrm>
+                      <a:off x="0" y="0"/>
+                      <a:ext cx="1123950" cy="1045210"/>
+                    </a:xfrm>
+                    <a:prstGeom prst="rect">
+                      <a:avLst/>
+                    </a:prstGeom>
+                    <a:noFill/>
+                    <a:ln>
+                      <a:noFill/>
+                    </a:ln>
+                  </pic:spPr>
+                </pic:pic>
+              </a:graphicData>
+            </a:graphic>
+            <wp14:sizeRelH relativeFrom="margin">
+              <wp14:pctWidth>0</wp14:pctWidth>
+            </wp14:sizeRelH>
+            <wp14:sizeRelV relativeFrom="margin">
+              <wp14:pctHeight>0</wp14:pctHeight>
+            </wp14:sizeRelV>
+          </wp:anchor>
+        </w:drawing>
+      </w:r>
+    </w:p>
+    <w:p>
+      <w:pPr>
+        <w:spacing w:after="0" w:line="240" w:lineRule="auto"/>
+        <w:jc w:val="center"/>
+        <w:rPr>
+          <w:b/>
+          <w:bCs/>
+        </w:rPr>
+      </w:pPr>
+      <w:r>
+        <w:rPr>
+          <w:b/>
+          <w:bCs/>
+        </w:rPr>
+        <w:t>UNIVERSIDAD DEL MAGDALENA</w:t>
+      </w:r>
+    </w:p>
+    <w:p>
+      <w:pPr>
+        <w:spacing w:after="0" w:line="240" w:lineRule="auto"/>
+        <w:jc w:val="center"/>
+        <w:rPr>
+          <w:b/>
+          <w:bCs/>
+        </w:rPr>
+      </w:pPr>
+      <w:r>
+        <w:rPr>
+          <w:b/>
+          <w:bCs/>
+        </w:rPr>
+        <w:t>ESPECIALIZACIÓN EN MACHINE LEARNING APLICADO</w:t>
+      </w:r>
+    </w:p>
+    <w:p>
+      <w:pPr>
+        <w:spacing w:after="0"/>
+        <w:jc w:val="center"/>
+        <w:rPr>
+          <w:b/>
+          <w:bCs/>
+        </w:rPr>
+      </w:pPr>
+      <w:r>
+        <w:rPr>
+          <w:b/>
+          <w:bCs/>
+        </w:rPr>
+        <w:t>PROGRAMACIÓN PARA CIENCIA DE DATOS</w:t>
+      </w:r>
+    </w:p>
+    <w:p>
+      <w:pPr>
+        <w:spacing w:after="0"/>
+        <w:jc w:val="center"/>
+        <w:rPr>
+          <w:b/>
+          <w:bCs/>
+        </w:rPr>
+      </w:pPr>
+    </w:p>
+    <w:p>
+      <w:pPr>
+        <w:spacing w:after="0"/>
+        <w:jc w:val="center"/>
+        <w:rPr>
+          <w:b/>
+          <w:bCs/>
+        </w:rPr>
+      </w:pPr>
+    </w:p>
+    <w:p>
+      <w:pPr>
+        <w:spacing w:after="0"/>
+        <w:jc w:val="center"/>
+        <w:rPr>
+          <w:b/>
+          <w:bCs/>
+        </w:rPr>
+      </w:pPr>
+    </w:p>
+    <w:p>
+      <w:pPr>
+        <w:spacing w:after="0"/>
+        <w:jc w:val="center"/>
+        <w:rPr>
+          <w:b/>
+          <w:bCs/>
+        </w:rPr>
+      </w:pPr>
+    </w:p>
+    <w:p>
+      <w:pPr>
+        <w:spacing w:after="0"/>
+        <w:jc w:val="center"/>
+        <w:rPr>
+          <w:b/>
+          <w:bCs/>
+        </w:rPr>
+      </w:pPr>
+    </w:p>
+    <w:p>
+      <w:pPr>
+        <w:rPr>
+          <w:lang w:val="pt-PT"/>
+        </w:rPr>
+      </w:pPr>
+    </w:p>
+    <w:p>
+      <w:pPr>
+        <w:rPr>
+          <w:lang w:val="pt-PT"/>
+        </w:rPr>
+      </w:pPr>
+    </w:p>
+    <w:p>
+      <w:pPr>
+        <w:jc w:val="center"/>
+        <w:rPr>
+          <w:b/>
+          <w:bCs/>
+        </w:rPr>
+      </w:pPr>
+      <w:r>
+        <w:rPr>
+          <w:b/>
+          <w:bCs/>
+        </w:rPr>
+        <w:t>I</w:t>
+      </w:r>
+      <w:r>
+        <w:rPr>
+          <w:b/>
+          <w:bCs/>
+        </w:rPr>
+        <w:t>NFORME</w:t>
+      </w:r>
+      <w:r>
+        <w:rPr>
+          <w:b/>
+          <w:bCs/>
+        </w:rPr>
+        <w:t xml:space="preserve"> DE CODIFICACIÓN </w:t>
+      </w:r>
+      <w:r>
+        <w:rPr>
+          <w:b/>
+          <w:bCs/>
+        </w:rPr>
+        <w:t xml:space="preserve">EN PHYTON </w:t>
+      </w:r>
+      <w:r>
+        <w:rPr>
+          <w:b/>
+          <w:bCs/>
+        </w:rPr>
+        <w:t xml:space="preserve">DE BASE DE DATOS </w:t>
+      </w:r>
+      <w:r>
+        <w:rPr>
+          <w:b/>
+          <w:bCs/>
+        </w:rPr>
+        <w:t xml:space="preserve">SOBRE EL </w:t>
+      </w:r>
+      <w:r>
+        <w:rPr>
+          <w:b/>
+          <w:bCs/>
+        </w:rPr>
+        <w:t>CUMPLIMIENTO IMPUESTO PREDIAL 2007 A 2023 DE BOGOTÁ D.C.</w:t>
+      </w:r>
+      <w:r>
+        <w:rPr>
+          <w:b/>
+          <w:bCs/>
+        </w:rPr>
+        <w:t xml:space="preserve"> Y ANÁLISIS DE RESULTADOS</w:t>
+      </w:r>
+      <w:r>
+        <w:rPr>
+          <w:b/>
+          <w:bCs/>
+        </w:rPr>
+        <w:t xml:space="preserve"> OBTENIDOS</w:t>
+      </w:r>
+    </w:p>
+    <w:p>
+      <w:pPr>
+        <w:ind w:firstLine="4111"/>
+        <w:rPr>
+          <w:b/>
+          <w:bCs/>
+        </w:rPr>
+      </w:pPr>
+    </w:p>
+    <w:p>
+      <w:pPr>
+        <w:ind w:firstLine="4111"/>
+        <w:rPr>
+          <w:b/>
+          <w:bCs/>
+        </w:rPr>
+      </w:pPr>
+    </w:p>
+    <w:p>
+      <w:pPr>
+        <w:ind w:firstLine="4111"/>
+        <w:rPr>
+          <w:b/>
+          <w:bCs/>
+        </w:rPr>
+      </w:pPr>
+    </w:p>
+    <w:p>
+      <w:pPr>
+        <w:ind w:firstLine="4111"/>
+      </w:pPr>
+      <w:r>
+        <w:rPr>
+          <w:b/>
+          <w:bCs/>
+        </w:rPr>
+        <w:t>Autores:</w:t>
       </w:r>
       <w:r>
         <w:t xml:space="preserve"> </w:t>
       </w:r>
-    </w:p>
-    <w:p>
-      <w:r>
-        <w:t>Autores: Juan Camilo Quintero Galvis, Luis Felipe Orduz Contreras y Rocío Tíjaro Rojas</w:t>
-      </w:r>
-    </w:p>
-    <w:p>
-      <w:pPr>
-        <w:pStyle w:val="Prrafodelista"/>
-        <w:numPr>
-          <w:ilvl w:val="0"/>
-          <w:numId w:val="1"/>
-        </w:numPr>
-      </w:pPr>
-      <w:r>
-        <w:t xml:space="preserve">Selección y justificación del </w:t>
-      </w:r>
-      <w:proofErr w:type="spellStart"/>
-      <w:r>
-        <w:t>dataset</w:t>
-      </w:r>
-      <w:proofErr w:type="spellEnd"/>
-    </w:p>
-    <w:p>
-      <w:pPr>
-        <w:pStyle w:val="Prrafodelista"/>
-      </w:pPr>
-      <w:r>
-        <w:t xml:space="preserve">De la base de datos de </w:t>
+      <w:r>
+        <w:t xml:space="preserve">   </w:t>
+      </w:r>
+      <w:r>
+        <w:t>Juan Camilo Quintero Galvis</w:t>
+      </w:r>
+    </w:p>
+    <w:p>
+      <w:pPr>
+        <w:ind w:firstLine="5245"/>
+      </w:pPr>
+      <w:r>
+        <w:t xml:space="preserve">Luis Felipe Orduz Contreras </w:t>
+      </w:r>
+    </w:p>
+    <w:p>
+      <w:pPr>
+        <w:ind w:firstLine="5245"/>
+      </w:pPr>
+      <w:r>
+        <w:t>Rocío Tíjaro Rojas</w:t>
+      </w:r>
+    </w:p>
+    <w:p/>
+    <w:p/>
+    <w:p/>
+    <w:p>
+      <w:pPr>
+        <w:ind w:firstLine="4111"/>
+        <w:rPr>
+          <w:lang w:val="pt-PT"/>
+        </w:rPr>
+      </w:pPr>
+      <w:r>
+        <w:rPr>
+          <w:b/>
+          <w:bCs/>
+          <w:lang w:val="pt-PT"/>
+        </w:rPr>
+        <w:t>Docente:</w:t>
+      </w:r>
+      <w:r>
+        <w:rPr>
+          <w:lang w:val="pt-PT"/>
+        </w:rPr>
+        <w:t xml:space="preserve">  Ph.D. Ernesto Galv</w:t>
+      </w:r>
+      <w:r>
+        <w:rPr>
+          <w:lang w:val="pt-PT"/>
+        </w:rPr>
+        <w:t>is Lista</w:t>
+      </w:r>
+    </w:p>
+    <w:p>
+      <w:pPr>
+        <w:rPr>
+          <w:lang w:val="pt-PT"/>
+        </w:rPr>
+      </w:pPr>
+    </w:p>
+    <w:p>
+      <w:pPr>
+        <w:rPr>
+          <w:lang w:val="pt-PT"/>
+        </w:rPr>
+      </w:pPr>
+    </w:p>
+    <w:p>
+      <w:pPr>
+        <w:rPr>
+          <w:lang w:val="pt-PT"/>
+        </w:rPr>
+      </w:pPr>
+    </w:p>
+    <w:p>
+      <w:pPr>
+        <w:rPr>
+          <w:lang w:val="pt-PT"/>
+        </w:rPr>
+      </w:pPr>
+    </w:p>
+    <w:p>
+      <w:pPr>
+        <w:jc w:val="center"/>
+      </w:pPr>
+      <w:r>
+        <w:t xml:space="preserve">Santa Marta, 15 de </w:t>
       </w:r>
       <w:proofErr w:type="gramStart"/>
       <w:r>
-        <w:t>información  pública</w:t>
+        <w:t>Junio</w:t>
       </w:r>
       <w:proofErr w:type="gramEnd"/>
       <w:r>
-        <w:t xml:space="preserve"> de Colombia </w:t>
-      </w:r>
-      <w:hyperlink r:id="rId5" w:history="1">
+        <w:t xml:space="preserve"> d</w:t>
+      </w:r>
+      <w:r>
+        <w:t>e 2026</w:t>
+      </w:r>
+    </w:p>
+    <w:p>
+      <w:pPr>
+        <w:rPr>
+          <w:b/>
+          <w:bCs/>
+        </w:rPr>
+      </w:pPr>
+      <w:r>
+        <w:rPr>
+          <w:b/>
+          <w:bCs/>
+        </w:rPr>
+        <w:lastRenderedPageBreak/>
+        <w:t>INTRODUCCIÓN</w:t>
+      </w:r>
+    </w:p>
+    <w:p>
+      <w:pPr>
+        <w:jc w:val="both"/>
+      </w:pPr>
+      <w:r>
+        <w:t>Para el inicio de este trabajo, d</w:t>
+      </w:r>
+      <w:r>
+        <w:t xml:space="preserve">e la </w:t>
+      </w:r>
+      <w:r>
+        <w:t xml:space="preserve">página web </w:t>
+      </w:r>
+      <w:r>
+        <w:t xml:space="preserve">de información pública de Colombia </w:t>
+      </w:r>
+      <w:hyperlink r:id="rId6" w:history="1">
         <w:r>
           <w:rPr>
             <w:rStyle w:val="Hipervnculo"/>
@@ -65,9 +455,21 @@
         <w:t>8.000 registros y 15 variables entre numéricas y categóricas</w:t>
       </w:r>
       <w:r>
-        <w:t xml:space="preserve">).  La base de datos seleccionada es </w:t>
-      </w:r>
-      <w:hyperlink r:id="rId6" w:history="1">
+        <w:t xml:space="preserve">).  </w:t>
+      </w:r>
+      <w:r>
+        <w:t xml:space="preserve">El data set </w:t>
+      </w:r>
+      <w:r>
+        <w:t>seleccionad</w:t>
+      </w:r>
+      <w:r>
+        <w:t>o</w:t>
+      </w:r>
+      <w:r>
+        <w:t xml:space="preserve"> es </w:t>
+      </w:r>
+      <w:hyperlink r:id="rId7" w:history="1">
         <w:r>
           <w:rPr>
             <w:rStyle w:val="Hipervnculo"/>
@@ -76,10 +478,28 @@
         </w:r>
       </w:hyperlink>
       <w:r>
-        <w:t xml:space="preserve">  la que contiene 168287 registros con 17 variables de las cuales ocho (8) variables son numéricas y nueve (9) son categóricas. Este data set </w:t>
-      </w:r>
-      <w:r>
-        <w:t>Cumplimiento impuesto predial</w:t>
+        <w:t>,</w:t>
+      </w:r>
+      <w:r>
+        <w:t xml:space="preserve"> que contiene 168</w:t>
+      </w:r>
+      <w:r>
+        <w:t>,</w:t>
+      </w:r>
+      <w:r>
+        <w:t xml:space="preserve">287 registros con 17 variables de las cuales ocho (8) variables son numéricas y nueve (9) son categóricas. Este data set </w:t>
+      </w:r>
+      <w:r>
+        <w:t>sobre el c</w:t>
+      </w:r>
+      <w:r>
+        <w:t xml:space="preserve">umplimiento </w:t>
+      </w:r>
+      <w:r>
+        <w:t xml:space="preserve">en el pago del </w:t>
+      </w:r>
+      <w:r>
+        <w:t>impuesto predial</w:t>
       </w:r>
       <w:r>
         <w:t xml:space="preserve"> contiene </w:t>
@@ -88,7 +508,10 @@
         <w:t>predios obligados, no obligados, con pago oportuno o extemporáneo, predios morosos y no declarantes por</w:t>
       </w:r>
       <w:r>
-        <w:t xml:space="preserve"> código de uso (destino SHD), localidad, barrio, </w:t>
+        <w:t xml:space="preserve"> código de uso (destino SHD), localidad, barrio</w:t>
+      </w:r>
+      <w:r>
+        <w:t xml:space="preserve"> y </w:t>
       </w:r>
       <w:r>
         <w:t>a</w:t>
@@ -97,24 +520,335 @@
         <w:t>ñ</w:t>
       </w:r>
       <w:r>
-        <w:t xml:space="preserve">o gravable de </w:t>
+        <w:t>o gravable de la</w:t>
+      </w:r>
+      <w:r>
+        <w:t>s</w:t>
+      </w:r>
+      <w:r>
+        <w:t xml:space="preserve"> vigencia</w:t>
+      </w:r>
+      <w:r>
+        <w:t>s</w:t>
+      </w:r>
+      <w:r>
+        <w:t xml:space="preserve"> 2007 a 2023</w:t>
+      </w:r>
+      <w:r>
+        <w:t>.</w:t>
+      </w:r>
+    </w:p>
+    <w:p>
+      <w:pPr>
+        <w:jc w:val="both"/>
+      </w:pPr>
+      <w:r>
+        <w:t>Antes de empezar a codificar es indispensable conocer el contexto de la información que se evidencia en los registros</w:t>
+      </w:r>
+      <w:r>
+        <w:t xml:space="preserve"> y el objetivo del usuario para realizar el análisis adecuado de los datos</w:t>
+      </w:r>
+      <w:r>
+        <w:t xml:space="preserve">. </w:t>
+      </w:r>
+    </w:p>
+    <w:p>
+      <w:pPr>
+        <w:jc w:val="both"/>
+      </w:pPr>
+      <w:r>
+        <w:t>En Bogotá, el Impuesto Predial Unificado (IPU) es</w:t>
+      </w:r>
+      <w:r>
+        <w:t xml:space="preserve"> el impuesto que grava los bienes inmuebles</w:t>
+      </w:r>
+      <w:r>
+        <w:rPr>
+          <w:b/>
+          <w:bCs/>
+        </w:rPr>
+        <w:t>)</w:t>
+      </w:r>
+      <w:r>
+        <w:t xml:space="preserve"> y </w:t>
+      </w:r>
+      <w:r>
+        <w:t xml:space="preserve">lo </w:t>
+      </w:r>
+      <w:r>
+        <w:t>regula</w:t>
+      </w:r>
+      <w:r>
+        <w:t xml:space="preserve"> </w:t>
+      </w:r>
+      <w:r>
+        <w:t>el Estatuto Tributario Distrital</w:t>
+      </w:r>
+      <w:r>
+        <w:t xml:space="preserve"> en el </w:t>
+      </w:r>
+      <w:r>
+        <w:t>Decreto Distrital 352 de 2002, Capítulo I (artículos 13 a 45), además de las actualizaciones posteriores mediante acuerdos y decretos distritales</w:t>
+      </w:r>
+      <w:r>
+        <w:t xml:space="preserve"> y leyes y normas nacionales</w:t>
+      </w:r>
+      <w:r>
+        <w:t xml:space="preserve">.  Las Tarifas del IPU se establecen en los artículos 25 y 26 de dicho Decreto y dependen </w:t>
+      </w:r>
+      <w:r>
+        <w:t>El IPU lo deben pagar todos los propietarios de predios y este se calcula al multiplicar el avalúo catastral por la tarifa previamente mencionada. El avalúo catastral, a su vez, depende del área construida y área de terreno, destino económico (destino SHD), localidad, e</w:t>
+      </w:r>
+      <w:r>
+        <w:t>strato</w:t>
+      </w:r>
+      <w:r>
+        <w:t xml:space="preserve"> y año gravable</w:t>
+      </w:r>
+      <w:r>
+        <w:t>. Este mismo decreto establece en su</w:t>
+      </w:r>
+      <w:r>
+        <w:t>s</w:t>
+      </w:r>
+      <w:r>
+        <w:t xml:space="preserve"> artículo</w:t>
+      </w:r>
+      <w:r>
+        <w:t>s</w:t>
+      </w:r>
+      <w:r>
+        <w:t xml:space="preserve"> 19 </w:t>
+      </w:r>
+      <w:r>
+        <w:t xml:space="preserve">y 28 </w:t>
+      </w:r>
+      <w:r>
+        <w:t xml:space="preserve">los predios que no declaran y están exentos de pago del IPU siendo estos: </w:t>
+      </w:r>
+      <w:r>
+        <w:t>a) Los salones comunales de propiedad de las Juntas de Acción Comunal</w:t>
+      </w:r>
+      <w:r>
+        <w:t xml:space="preserve">; </w:t>
+      </w:r>
+      <w:r>
+        <w:t>b) Los predios edificados residenciales de los estratos 1 y 2 cuyo avalúo catastral sea inferior a tres millones de pesos ($3.000.000)</w:t>
+      </w:r>
+      <w:r>
+        <w:t xml:space="preserve">; </w:t>
+      </w:r>
+      <w:r>
+        <w:t>c) Las tumbas y bóvedas de los cementerios, siempre y cuando no sean de propiedad de los parques cementerio</w:t>
+      </w:r>
+      <w:r>
+        <w:t xml:space="preserve">; </w:t>
+      </w:r>
+      <w:r>
+        <w:t>d) Los inmuebles de propiedad de la iglesia católica, destinados al culto y vivienda de las comunidades religiosas, a las curias diocesanas y arquidiocesanas, casas episcopales y curales, y seminarios conciliares</w:t>
+      </w:r>
+      <w:r>
+        <w:t xml:space="preserve">; </w:t>
+      </w:r>
+      <w:r>
+        <w:t>e) Los inmuebles de propiedad de otras iglesias diferentes a la católica, reconocidas por el Estado Colombiano y destinadas al culto, a las casas pastorales, seminarios y sedes conciliares</w:t>
+      </w:r>
+      <w:r>
+        <w:t>; f</w:t>
+      </w:r>
+      <w:r>
+        <w:t>) Los edificios declarados específicamente como monumentos nacionales por el consejo del ramo, siempre y cuando el sujeto pasivo del tributo no tenga ánimo de lucro</w:t>
+      </w:r>
+      <w:r>
+        <w:t>; h</w:t>
+      </w:r>
+      <w:r>
+        <w:t xml:space="preserve">) Los edificios sometidos a los tratamientos especiales de conservación histórica, artística, o arquitectónica, durante el tiempo en el que se mantengan bajo el imperio de las normas </w:t>
+      </w:r>
+      <w:r>
+        <w:t>específicas</w:t>
+      </w:r>
+      <w:r>
+        <w:t xml:space="preserve"> de dichos tratamientos</w:t>
+      </w:r>
+      <w:r>
+        <w:t>; i</w:t>
+      </w:r>
+      <w:r>
+        <w:t xml:space="preserve">) Los inmuebles de propiedad de las entidades sindicales de trabajadores, de primero, </w:t>
+      </w:r>
+      <w:r>
+        <w:lastRenderedPageBreak/>
+        <w:t>segundo y tercer grado, destinados a la actividad sindical</w:t>
+      </w:r>
+      <w:r>
+        <w:t>, j</w:t>
+      </w:r>
+      <w:r>
+        <w:t>) Los inmuebles de propiedad del Distrito Capital de Bogotá destinados a cumplir las funciones propias de la creación de cada dependencia, así como los destinados a la conservación de hoyas, canales y conducción de aguas, embalses, colectores de alcantarillado, tanques, plantas de purificación, servidumbres activas, plantas de energía y de teléfonos, vías de uso público y sobrantes de construcciones</w:t>
+      </w:r>
+      <w:r>
+        <w:t>, k</w:t>
+      </w:r>
+      <w:r>
+        <w:t xml:space="preserve">) Los inmuebles que en su integridad se destinen exclusivamente y con carácter de permanencia por las entidades de beneficencia y asistencia pública y las de utilidad pública de interés social destinados exclusivamente a servicios de hospitalización, </w:t>
+      </w:r>
+      <w:proofErr w:type="spellStart"/>
+      <w:r>
+        <w:t>salacunas</w:t>
+      </w:r>
+      <w:proofErr w:type="spellEnd"/>
+      <w:r>
+        <w:t>, guarderías, y asilos, así como los inmuebles de las fundaciones de derecho público o de derecho privado cuyo objeto sea exclusivamente la atención a la salud y la educación especial de niños y jóvenes con deficiencias de carácter físico, mental y psicológico, reconocidas por la autoridad competente, estarán exentas por el término a que se refiere el artículo primero del Acuerdo 9 de 1993, en un ciento por ciento, del valor del impuesto predial unificado a pagar por la respectiva entidad por ese predio en el correspondiente año fiscal</w:t>
+      </w:r>
+      <w:r>
+        <w:t>; l</w:t>
+      </w:r>
+      <w:r>
+        <w:t>) Las personas naturales y jurídicas, así como las sociedades de hecho, damnificadas a consecuencia de actos terroristas o catástrofes naturales ocurridas en el Distrito Capital, respecto de los bienes que resulten afectados en las mismas, en las condiciones que para el efecto se establezcan en el decreto reglamentario</w:t>
+      </w:r>
+      <w:r>
+        <w:t>; m</w:t>
+      </w:r>
+      <w:r>
+        <w:t>) Las edificaciones nuevas que se construyan en el área urbana del Distrito Capital de Bogotá para estacionamientos públicos, entre el 21 de diciembre de 1998 y el 31 de diciembre del año 2001, estarán exentas del pago del impuesto predial unificado, por un término de diez (10) años contados a partir del año siguiente a la terminación de la construcción</w:t>
+      </w:r>
+      <w:r>
+        <w:t xml:space="preserve"> </w:t>
+      </w:r>
+      <w:r>
+        <w:t>(</w:t>
+      </w:r>
+      <w:hyperlink r:id="rId8" w:history="1">
+        <w:r>
+          <w:rPr>
+            <w:rStyle w:val="Hipervnculo"/>
+          </w:rPr>
+          <w:t>https://compilacionjuridica.shd.gov.co</w:t>
+        </w:r>
+      </w:hyperlink>
+      <w:r>
+        <w:t>)</w:t>
+      </w:r>
+      <w:r>
+        <w:t>.</w:t>
+      </w:r>
+      <w:r>
+        <w:t xml:space="preserve"> </w:t>
+      </w:r>
+    </w:p>
+    <w:p>
+      <w:pPr>
+        <w:jc w:val="both"/>
+      </w:pPr>
+      <w:r>
+        <w:t xml:space="preserve">El recaudo de este impuesto administrado por el Distrito </w:t>
       </w:r>
       <w:proofErr w:type="gramStart"/>
       <w:r>
-        <w:t>la</w:t>
-      </w:r>
-      <w:r>
-        <w:t>s</w:t>
-      </w:r>
-      <w:r>
-        <w:t xml:space="preserve"> vigencia</w:t>
+        <w:t>Capital,</w:t>
       </w:r>
       <w:proofErr w:type="gramEnd"/>
       <w:r>
-        <w:t xml:space="preserve"> 2007 a 2023</w:t>
-      </w:r>
-    </w:p>
-    <w:p/>
+        <w:t xml:space="preserve"> se distribuye </w:t>
+      </w:r>
+      <w:r>
+        <w:t>conforme al Plan de Desarrollo y al presupuesto anual aprobado</w:t>
+      </w:r>
+      <w:r>
+        <w:t xml:space="preserve"> en rubros como </w:t>
+      </w:r>
+      <w:r>
+        <w:t>a) e</w:t>
+      </w:r>
+      <w:r>
+        <w:t>ducación pública</w:t>
+      </w:r>
+      <w:r>
+        <w:t>; b) s</w:t>
+      </w:r>
+      <w:r>
+        <w:t>alud</w:t>
+      </w:r>
+      <w:r>
+        <w:t>; c)</w:t>
+      </w:r>
+      <w:r>
+        <w:t xml:space="preserve"> </w:t>
+      </w:r>
+      <w:r>
+        <w:t>i</w:t>
+      </w:r>
+      <w:r>
+        <w:t>nfraestructura vial</w:t>
+      </w:r>
+      <w:r>
+        <w:t>; d) e</w:t>
+      </w:r>
+      <w:r>
+        <w:t>spacio público</w:t>
+      </w:r>
+      <w:r>
+        <w:t>, e) s</w:t>
+      </w:r>
+      <w:r>
+        <w:t>eguridad y convivencia</w:t>
+      </w:r>
+      <w:r>
+        <w:t>; f) mo</w:t>
+      </w:r>
+      <w:r>
+        <w:t>vilidad y transporte</w:t>
+      </w:r>
+      <w:r>
+        <w:t>, g) p</w:t>
+      </w:r>
+      <w:r>
+        <w:t>rogramas sociales</w:t>
+      </w:r>
+      <w:r>
+        <w:t>, h) g</w:t>
+      </w:r>
+      <w:r>
+        <w:t>estión ambiental y parque</w:t>
+      </w:r>
+      <w:r>
+        <w:t>s, entre otros.</w:t>
+      </w:r>
+    </w:p>
+    <w:p>
+      <w:pPr>
+        <w:jc w:val="both"/>
+      </w:pPr>
+      <w:r>
+        <w:t xml:space="preserve">Como administrador público de este recaudo, es importante conocer </w:t>
+      </w:r>
+      <w:r>
+        <w:t>los pagos p</w:t>
+      </w:r>
+      <w:r>
+        <w:t>romedio por unidad predial</w:t>
+      </w:r>
+      <w:r>
+        <w:t xml:space="preserve"> y tipo de destino y categorizar en qué umbrales se encuentran los recaudos altos medios y bajos, para tomar decisiones que hagan más efectivo el cumplimiento para su reinversión en obras para los ciudadanos. </w:t>
+      </w:r>
+    </w:p>
+    <w:p>
+      <w:pPr>
+        <w:jc w:val="both"/>
+      </w:pPr>
+      <w:r>
+        <w:t> </w:t>
+      </w:r>
+    </w:p>
+    <w:p>
+      <w:pPr>
+        <w:jc w:val="both"/>
+      </w:pPr>
+      <w:r>
+        <w:t> </w:t>
+      </w:r>
+    </w:p>
     <w:sectPr>
       <w:pgSz w:w="12240" w:h="15840"/>
       <w:pgMar w:top="1417" w:right="1701" w:bottom="1417" w:left="1701" w:header="708" w:footer="708" w:gutter="0"/>
@@ -216,8 +950,124 @@
       </w:pPr>
     </w:lvl>
   </w:abstractNum>
+  <w:abstractNum w:abstractNumId="1" w15:restartNumberingAfterBreak="0">
+    <w:nsid w:val="31FF315D"/>
+    <w:multiLevelType w:val="multilevel"/>
+    <w:tmpl w:val="F10ACB92"/>
+    <w:lvl w:ilvl="0">
+      <w:start w:val="1"/>
+      <w:numFmt w:val="decimal"/>
+      <w:lvlText w:val="%1."/>
+      <w:lvlJc w:val="left"/>
+      <w:pPr>
+        <w:tabs>
+          <w:tab w:val="num" w:pos="720"/>
+        </w:tabs>
+        <w:ind w:left="720" w:hanging="360"/>
+      </w:pPr>
+    </w:lvl>
+    <w:lvl w:ilvl="1" w:tentative="1">
+      <w:start w:val="1"/>
+      <w:numFmt w:val="decimal"/>
+      <w:lvlText w:val="%2."/>
+      <w:lvlJc w:val="left"/>
+      <w:pPr>
+        <w:tabs>
+          <w:tab w:val="num" w:pos="1440"/>
+        </w:tabs>
+        <w:ind w:left="1440" w:hanging="360"/>
+      </w:pPr>
+    </w:lvl>
+    <w:lvl w:ilvl="2" w:tentative="1">
+      <w:start w:val="1"/>
+      <w:numFmt w:val="decimal"/>
+      <w:lvlText w:val="%3."/>
+      <w:lvlJc w:val="left"/>
+      <w:pPr>
+        <w:tabs>
+          <w:tab w:val="num" w:pos="2160"/>
+        </w:tabs>
+        <w:ind w:left="2160" w:hanging="360"/>
+      </w:pPr>
+    </w:lvl>
+    <w:lvl w:ilvl="3" w:tentative="1">
+      <w:start w:val="1"/>
+      <w:numFmt w:val="decimal"/>
+      <w:lvlText w:val="%4."/>
+      <w:lvlJc w:val="left"/>
+      <w:pPr>
+        <w:tabs>
+          <w:tab w:val="num" w:pos="2880"/>
+        </w:tabs>
+        <w:ind w:left="2880" w:hanging="360"/>
+      </w:pPr>
+    </w:lvl>
+    <w:lvl w:ilvl="4" w:tentative="1">
+      <w:start w:val="1"/>
+      <w:numFmt w:val="decimal"/>
+      <w:lvlText w:val="%5."/>
+      <w:lvlJc w:val="left"/>
+      <w:pPr>
+        <w:tabs>
+          <w:tab w:val="num" w:pos="3600"/>
+        </w:tabs>
+        <w:ind w:left="3600" w:hanging="360"/>
+      </w:pPr>
+    </w:lvl>
+    <w:lvl w:ilvl="5" w:tentative="1">
+      <w:start w:val="1"/>
+      <w:numFmt w:val="decimal"/>
+      <w:lvlText w:val="%6."/>
+      <w:lvlJc w:val="left"/>
+      <w:pPr>
+        <w:tabs>
+          <w:tab w:val="num" w:pos="4320"/>
+        </w:tabs>
+        <w:ind w:left="4320" w:hanging="360"/>
+      </w:pPr>
+    </w:lvl>
+    <w:lvl w:ilvl="6" w:tentative="1">
+      <w:start w:val="1"/>
+      <w:numFmt w:val="decimal"/>
+      <w:lvlText w:val="%7."/>
+      <w:lvlJc w:val="left"/>
+      <w:pPr>
+        <w:tabs>
+          <w:tab w:val="num" w:pos="5040"/>
+        </w:tabs>
+        <w:ind w:left="5040" w:hanging="360"/>
+      </w:pPr>
+    </w:lvl>
+    <w:lvl w:ilvl="7" w:tentative="1">
+      <w:start w:val="1"/>
+      <w:numFmt w:val="decimal"/>
+      <w:lvlText w:val="%8."/>
+      <w:lvlJc w:val="left"/>
+      <w:pPr>
+        <w:tabs>
+          <w:tab w:val="num" w:pos="5760"/>
+        </w:tabs>
+        <w:ind w:left="5760" w:hanging="360"/>
+      </w:pPr>
+    </w:lvl>
+    <w:lvl w:ilvl="8" w:tentative="1">
+      <w:start w:val="1"/>
+      <w:numFmt w:val="decimal"/>
+      <w:lvlText w:val="%9."/>
+      <w:lvlJc w:val="left"/>
+      <w:pPr>
+        <w:tabs>
+          <w:tab w:val="num" w:pos="6480"/>
+        </w:tabs>
+        <w:ind w:left="6480" w:hanging="360"/>
+      </w:pPr>
+    </w:lvl>
+  </w:abstractNum>
   <w:num w:numId="1" w16cid:durableId="958953745">
     <w:abstractNumId w:val="0"/>
+  </w:num>
+  <w:num w:numId="2" w16cid:durableId="216359291">
+    <w:abstractNumId w:val="1"/>
   </w:num>
 </w:numbering>
 </file>
@@ -825,7 +1675,6 @@
   <w:style w:type="character" w:default="1" w:styleId="Fuentedeprrafopredeter">
     <w:name w:val="Default Paragraph Font"/>
     <w:uiPriority w:val="1"/>
-    <w:semiHidden/>
     <w:unhideWhenUsed/>
   </w:style>
   <w:style w:type="table" w:default="1" w:styleId="Tablanormal">
@@ -1148,6 +1997,29 @@
     <w:rPr>
       <w:color w:val="467886" w:themeColor="hyperlink"/>
       <w:u w:val="single"/>
+    </w:rPr>
+  </w:style>
+  <w:style w:type="character" w:styleId="Mencinsinresolver">
+    <w:name w:val="Unresolved Mention"/>
+    <w:basedOn w:val="Fuentedeprrafopredeter"/>
+    <w:uiPriority w:val="99"/>
+    <w:semiHidden/>
+    <w:unhideWhenUsed/>
+    <w:rsid w:val="00802E3C"/>
+    <w:rPr>
+      <w:color w:val="605E5C"/>
+      <w:shd w:val="clear" w:color="auto" w:fill="E1DFDD"/>
+    </w:rPr>
+  </w:style>
+  <w:style w:type="paragraph" w:styleId="NormalWeb">
+    <w:name w:val="Normal (Web)"/>
+    <w:basedOn w:val="Normal"/>
+    <w:uiPriority w:val="99"/>
+    <w:semiHidden/>
+    <w:unhideWhenUsed/>
+    <w:rsid w:val="00802E3C"/>
+    <w:rPr>
+      <w:rFonts w:ascii="Times New Roman" w:hAnsi="Times New Roman" w:cs="Times New Roman"/>
     </w:rPr>
   </w:style>
 </w:styles>

</xml_diff>

<commit_message>
enlace a video en INFORME
</commit_message>
<xml_diff>
--- a/INFORME.docx
+++ b/INFORME.docx
@@ -353,7 +353,15 @@
         <w:jc w:val="center"/>
       </w:pPr>
       <w:r>
-        <w:t>Santa Marta, 15 de Junio d</w:t>
+        <w:t xml:space="preserve">Santa Marta, 15 de </w:t>
+      </w:r>
+      <w:proofErr w:type="gramStart"/>
+      <w:r>
+        <w:t>Junio</w:t>
+      </w:r>
+      <w:proofErr w:type="gramEnd"/>
+      <w:r>
+        <w:t xml:space="preserve"> d</w:t>
       </w:r>
       <w:r>
         <w:t>e 2026</w:t>
@@ -692,7 +700,15 @@
         <w:jc w:val="both"/>
       </w:pPr>
       <w:r>
-        <w:t xml:space="preserve">El recaudo de este impuesto administrado por el Distrito Capital, se distribuye </w:t>
+        <w:t xml:space="preserve">El recaudo de este impuesto administrado por el Distrito </w:t>
+      </w:r>
+      <w:proofErr w:type="gramStart"/>
+      <w:r>
+        <w:t>Capital,</w:t>
+      </w:r>
+      <w:proofErr w:type="gramEnd"/>
+      <w:r>
+        <w:t xml:space="preserve"> se distribuye </w:t>
       </w:r>
       <w:r>
         <w:t>conforme al Plan de Desarrollo y al presupuesto anual aprobado</w:t>
@@ -1141,7 +1157,15 @@
           <w:i/>
           <w:iCs/>
         </w:rPr>
-        <w:t>dataframe_enrichment</w:t>
+        <w:t>dataframe_</w:t>
+      </w:r>
+      <w:proofErr w:type="gramStart"/>
+      <w:r>
+        <w:rPr>
+          <w:i/>
+          <w:iCs/>
+        </w:rPr>
+        <w:t>enrichment</w:t>
       </w:r>
       <w:proofErr w:type="spellEnd"/>
       <w:r>
@@ -1149,7 +1173,15 @@
           <w:i/>
           <w:iCs/>
         </w:rPr>
-        <w:t xml:space="preserve">() </w:t>
+        <w:t>(</w:t>
+      </w:r>
+      <w:proofErr w:type="gramEnd"/>
+      <w:r>
+        <w:rPr>
+          <w:i/>
+          <w:iCs/>
+        </w:rPr>
+        <w:t xml:space="preserve">) </w:t>
       </w:r>
       <w:r>
         <w:t>donde se exporta el resultado a “</w:t>
@@ -1408,7 +1440,16 @@
                 <w:sz w:val="18"/>
                 <w:szCs w:val="18"/>
               </w:rPr>
-              <w:t>new_columns</w:t>
+              <w:t>new_</w:t>
+            </w:r>
+            <w:proofErr w:type="gramStart"/>
+            <w:r>
+              <w:rPr>
+                <w:rFonts w:ascii="Consolas" w:eastAsia="Consolas" w:hAnsi="Consolas" w:cs="Consolas"/>
+                <w:sz w:val="18"/>
+                <w:szCs w:val="18"/>
+              </w:rPr>
+              <w:t>columns</w:t>
             </w:r>
             <w:proofErr w:type="spellEnd"/>
             <w:r>
@@ -1417,7 +1458,16 @@
                 <w:sz w:val="18"/>
                 <w:szCs w:val="18"/>
               </w:rPr>
-              <w:t>()</w:t>
+              <w:t>(</w:t>
+            </w:r>
+            <w:proofErr w:type="gramEnd"/>
+            <w:r>
+              <w:rPr>
+                <w:rFonts w:ascii="Consolas" w:eastAsia="Consolas" w:hAnsi="Consolas" w:cs="Consolas"/>
+                <w:sz w:val="18"/>
+                <w:szCs w:val="18"/>
+              </w:rPr>
+              <w:t>)</w:t>
             </w:r>
           </w:p>
         </w:tc>
@@ -1503,7 +1553,16 @@
                 <w:sz w:val="18"/>
                 <w:szCs w:val="18"/>
               </w:rPr>
-              <w:t>new_columns</w:t>
+              <w:t>new_</w:t>
+            </w:r>
+            <w:proofErr w:type="gramStart"/>
+            <w:r>
+              <w:rPr>
+                <w:rFonts w:ascii="Consolas" w:eastAsia="Consolas" w:hAnsi="Consolas" w:cs="Consolas"/>
+                <w:sz w:val="18"/>
+                <w:szCs w:val="18"/>
+              </w:rPr>
+              <w:t>columns</w:t>
             </w:r>
             <w:proofErr w:type="spellEnd"/>
             <w:r>
@@ -1512,7 +1571,16 @@
                 <w:sz w:val="18"/>
                 <w:szCs w:val="18"/>
               </w:rPr>
-              <w:t>()</w:t>
+              <w:t>(</w:t>
+            </w:r>
+            <w:proofErr w:type="gramEnd"/>
+            <w:r>
+              <w:rPr>
+                <w:rFonts w:ascii="Consolas" w:eastAsia="Consolas" w:hAnsi="Consolas" w:cs="Consolas"/>
+                <w:sz w:val="18"/>
+                <w:szCs w:val="18"/>
+              </w:rPr>
+              <w:t>)</w:t>
             </w:r>
           </w:p>
         </w:tc>
@@ -1591,6 +1659,7 @@
           </w:tcPr>
           <w:p>
             <w:proofErr w:type="spellStart"/>
+            <w:proofErr w:type="gramStart"/>
             <w:r>
               <w:rPr>
                 <w:rFonts w:ascii="Consolas" w:eastAsia="Consolas" w:hAnsi="Consolas" w:cs="Consolas"/>
@@ -1606,7 +1675,16 @@
                 <w:sz w:val="18"/>
                 <w:szCs w:val="18"/>
               </w:rPr>
-              <w:t>()</w:t>
+              <w:t>(</w:t>
+            </w:r>
+            <w:proofErr w:type="gramEnd"/>
+            <w:r>
+              <w:rPr>
+                <w:rFonts w:ascii="Consolas" w:eastAsia="Consolas" w:hAnsi="Consolas" w:cs="Consolas"/>
+                <w:sz w:val="18"/>
+                <w:szCs w:val="18"/>
+              </w:rPr>
+              <w:t>)</w:t>
             </w:r>
           </w:p>
         </w:tc>
@@ -1654,7 +1732,15 @@
           <w:i/>
           <w:iCs/>
         </w:rPr>
-        <w:t>load_taxes_data</w:t>
+        <w:t>load_taxes_</w:t>
+      </w:r>
+      <w:proofErr w:type="gramStart"/>
+      <w:r>
+        <w:rPr>
+          <w:i/>
+          <w:iCs/>
+        </w:rPr>
+        <w:t>data</w:t>
       </w:r>
       <w:proofErr w:type="spellEnd"/>
       <w:r>
@@ -1662,7 +1748,15 @@
           <w:i/>
           <w:iCs/>
         </w:rPr>
-        <w:t>()”</w:t>
+        <w:t>(</w:t>
+      </w:r>
+      <w:proofErr w:type="gramEnd"/>
+      <w:r>
+        <w:rPr>
+          <w:i/>
+          <w:iCs/>
+        </w:rPr>
+        <w:t>)”</w:t>
       </w:r>
       <w:r>
         <w:t xml:space="preserve"> e imputa los</w:t>
@@ -1685,7 +1779,15 @@
           <w:i/>
           <w:iCs/>
         </w:rPr>
-        <w:t>new_columns</w:t>
+        <w:t>new_</w:t>
+      </w:r>
+      <w:proofErr w:type="gramStart"/>
+      <w:r>
+        <w:rPr>
+          <w:i/>
+          <w:iCs/>
+        </w:rPr>
+        <w:t>columns</w:t>
       </w:r>
       <w:proofErr w:type="spellEnd"/>
       <w:r>
@@ -1693,7 +1795,15 @@
           <w:i/>
           <w:iCs/>
         </w:rPr>
-        <w:t>().</w:t>
+        <w:t>(</w:t>
+      </w:r>
+      <w:proofErr w:type="gramEnd"/>
+      <w:r>
+        <w:rPr>
+          <w:i/>
+          <w:iCs/>
+        </w:rPr>
+        <w:t>).</w:t>
       </w:r>
       <w:r>
         <w:t xml:space="preserve"> La función trabaja sobre una copia defensiva del </w:t>
@@ -1715,6 +1825,7 @@
         <w:t xml:space="preserve"> (</w:t>
       </w:r>
       <w:proofErr w:type="spellStart"/>
+      <w:proofErr w:type="gramStart"/>
       <w:r>
         <w:rPr>
           <w:i/>
@@ -1723,6 +1834,7 @@
         <w:t>dataframe.copy</w:t>
       </w:r>
       <w:proofErr w:type="spellEnd"/>
+      <w:proofErr w:type="gramEnd"/>
       <w:r>
         <w:rPr>
           <w:i/>
@@ -1775,7 +1887,15 @@
           <w:i/>
           <w:iCs/>
         </w:rPr>
-        <w:t>require_dataframe</w:t>
+        <w:t>require_</w:t>
+      </w:r>
+      <w:proofErr w:type="gramStart"/>
+      <w:r>
+        <w:rPr>
+          <w:i/>
+          <w:iCs/>
+        </w:rPr>
+        <w:t>dataframe</w:t>
       </w:r>
       <w:proofErr w:type="spellEnd"/>
       <w:r>
@@ -1783,7 +1903,15 @@
           <w:i/>
           <w:iCs/>
         </w:rPr>
-        <w:t>() en user_interface.py)</w:t>
+        <w:t>(</w:t>
+      </w:r>
+      <w:proofErr w:type="gramEnd"/>
+      <w:r>
+        <w:rPr>
+          <w:i/>
+          <w:iCs/>
+        </w:rPr>
+        <w:t>) en user_interface.py)</w:t>
       </w:r>
       <w:r>
         <w:t xml:space="preserve"> detecta ese valor y detiene el proceso de forma controlada</w:t>
@@ -1865,9 +1993,9 @@
           <w:sz w:val="18"/>
           <w:szCs w:val="18"/>
         </w:rPr>
-        <w:t>new_columns</w:t>
-      </w:r>
-      <w:proofErr w:type="spellEnd"/>
+        <w:t>new_</w:t>
+      </w:r>
+      <w:proofErr w:type="gramStart"/>
       <w:r>
         <w:rPr>
           <w:i/>
@@ -1876,7 +2004,29 @@
           <w:sz w:val="18"/>
           <w:szCs w:val="18"/>
         </w:rPr>
-        <w:t>() en business_logic.py: creación de las tres columnas derivadas.</w:t>
+        <w:t>columns</w:t>
+      </w:r>
+      <w:proofErr w:type="spellEnd"/>
+      <w:r>
+        <w:rPr>
+          <w:i/>
+          <w:iCs/>
+          <w:color w:val="595959"/>
+          <w:sz w:val="18"/>
+          <w:szCs w:val="18"/>
+        </w:rPr>
+        <w:t>(</w:t>
+      </w:r>
+      <w:proofErr w:type="gramEnd"/>
+      <w:r>
+        <w:rPr>
+          <w:i/>
+          <w:iCs/>
+          <w:color w:val="595959"/>
+          <w:sz w:val="18"/>
+          <w:szCs w:val="18"/>
+        </w:rPr>
+        <w:t>) en business_logic.py: creación de las tres columnas derivadas.</w:t>
       </w:r>
     </w:p>
     <w:p>
@@ -1952,6 +2102,7 @@
       <w:r>
         <w:t xml:space="preserve"> se obtiene un indicador comparable entre territorios. El </w:t>
       </w:r>
+      <w:proofErr w:type="gramStart"/>
       <w:r>
         <w:t>método</w:t>
       </w:r>
@@ -1960,7 +2111,15 @@
           <w:i/>
           <w:iCs/>
         </w:rPr>
-        <w:t xml:space="preserve"> .round(2)</w:t>
+        <w:t xml:space="preserve"> .round</w:t>
+      </w:r>
+      <w:proofErr w:type="gramEnd"/>
+      <w:r>
+        <w:rPr>
+          <w:i/>
+          <w:iCs/>
+        </w:rPr>
+        <w:t>(2)</w:t>
       </w:r>
       <w:r>
         <w:t xml:space="preserve"> limita el resultado a dos decimales.</w:t>
@@ -2105,12 +2264,21 @@
       <w:r>
         <w:t xml:space="preserve">Al aplicar el </w:t>
       </w:r>
-      <w:r>
-        <w:rPr>
-          <w:i/>
-          <w:iCs/>
-        </w:rPr>
-        <w:t>método .head(8)</w:t>
+      <w:proofErr w:type="gramStart"/>
+      <w:r>
+        <w:rPr>
+          <w:i/>
+          <w:iCs/>
+        </w:rPr>
+        <w:t>método .head</w:t>
+      </w:r>
+      <w:proofErr w:type="gramEnd"/>
+      <w:r>
+        <w:rPr>
+          <w:i/>
+          <w:iCs/>
+        </w:rPr>
+        <w:t>(8)</w:t>
       </w:r>
       <w:r>
         <w:t xml:space="preserve"> muestra solo las 8 primeras filas (del 0 al 7). </w:t>
@@ -2185,13 +2353,18 @@
         <w:jc w:val="both"/>
       </w:pPr>
       <w:r>
-        <w:t>El archivo de origen codifica el destino hacendario del predio con un número en la columna DESTINO_SHD. Para que tablas y gráficas sean legibles, el diccionario CODIGO_SHD traduce cada código a una etiqueta de texto, y la columna nueva se crea aplicando .</w:t>
+        <w:t xml:space="preserve">El archivo de origen codifica el destino hacendario del predio con un número en la columna DESTINO_SHD. Para que tablas y gráficas sean legibles, el diccionario CODIGO_SHD traduce cada código a una etiqueta de texto, y la columna nueva se crea </w:t>
+      </w:r>
+      <w:proofErr w:type="gramStart"/>
+      <w:r>
+        <w:t>aplicando .</w:t>
       </w:r>
       <w:proofErr w:type="spellStart"/>
       <w:r>
         <w:t>map</w:t>
       </w:r>
       <w:proofErr w:type="spellEnd"/>
+      <w:proofErr w:type="gramEnd"/>
       <w:r>
         <w:t xml:space="preserve">() sobre el código.  Cabe aclarar que el </w:t>
       </w:r>
@@ -2358,9 +2531,9 @@
           <w:sz w:val="18"/>
           <w:szCs w:val="18"/>
         </w:rPr>
-        <w:t>Figura 5. Asignación de NOMBRE_SHD mediante .</w:t>
-      </w:r>
-      <w:proofErr w:type="spellStart"/>
+        <w:t xml:space="preserve">Figura 5. Asignación de NOMBRE_SHD </w:t>
+      </w:r>
+      <w:proofErr w:type="gramStart"/>
       <w:r>
         <w:rPr>
           <w:i/>
@@ -2369,9 +2542,9 @@
           <w:sz w:val="18"/>
           <w:szCs w:val="18"/>
         </w:rPr>
-        <w:t>map</w:t>
-      </w:r>
-      <w:proofErr w:type="spellEnd"/>
+        <w:t>mediante .</w:t>
+      </w:r>
+      <w:proofErr w:type="spellStart"/>
       <w:r>
         <w:rPr>
           <w:i/>
@@ -2380,6 +2553,18 @@
           <w:sz w:val="18"/>
           <w:szCs w:val="18"/>
         </w:rPr>
+        <w:t>map</w:t>
+      </w:r>
+      <w:proofErr w:type="spellEnd"/>
+      <w:proofErr w:type="gramEnd"/>
+      <w:r>
+        <w:rPr>
+          <w:i/>
+          <w:iCs/>
+          <w:color w:val="595959"/>
+          <w:sz w:val="18"/>
+          <w:szCs w:val="18"/>
+        </w:rPr>
         <w:t>() (línea real del módulo</w:t>
       </w:r>
       <w:r>
@@ -2390,6 +2575,7 @@
       <w:pPr>
         <w:jc w:val="both"/>
       </w:pPr>
+      <w:proofErr w:type="gramStart"/>
       <w:r>
         <w:t>.</w:t>
       </w:r>
@@ -2398,6 +2584,7 @@
         <w:t>map</w:t>
       </w:r>
       <w:proofErr w:type="spellEnd"/>
+      <w:proofErr w:type="gramEnd"/>
       <w:r>
         <w:t xml:space="preserve">(CODIGO_SHD) busca cada valor de la columna como clave del diccionario. </w:t>
       </w:r>
@@ -4252,6 +4439,7 @@
         <w:t xml:space="preserve">columna etiqueta cada registro según su recaudo relativo frente al conjunto. El diseño usa una función fábrica: </w:t>
       </w:r>
       <w:proofErr w:type="spellStart"/>
+      <w:proofErr w:type="gramStart"/>
       <w:r>
         <w:rPr>
           <w:i/>
@@ -4265,7 +4453,15 @@
           <w:i/>
           <w:iCs/>
         </w:rPr>
-        <w:t xml:space="preserve">() </w:t>
+        <w:t>(</w:t>
+      </w:r>
+      <w:proofErr w:type="gramEnd"/>
+      <w:r>
+        <w:rPr>
+          <w:i/>
+          <w:iCs/>
+        </w:rPr>
+        <w:t xml:space="preserve">) </w:t>
       </w:r>
       <w:r>
         <w:t>recibe</w:t>
@@ -4330,6 +4526,7 @@
         <w:t>high_threshold</w:t>
       </w:r>
       <w:proofErr w:type="spellEnd"/>
+      <w:proofErr w:type="gramStart"/>
       <w:r>
         <w:rPr>
           <w:i/>
@@ -4344,7 +4541,11 @@
         <w:t xml:space="preserve"> </w:t>
       </w:r>
       <w:r>
-        <w:t xml:space="preserve"> y devuelve la función interna </w:t>
+        <w:t xml:space="preserve"> y</w:t>
+      </w:r>
+      <w:proofErr w:type="gramEnd"/>
+      <w:r>
+        <w:t xml:space="preserve"> devuelve la función interna </w:t>
       </w:r>
       <w:proofErr w:type="spellStart"/>
       <w:r>
@@ -4352,7 +4553,15 @@
           <w:i/>
           <w:iCs/>
         </w:rPr>
-        <w:t>profitability_calculation</w:t>
+        <w:t>profitability_</w:t>
+      </w:r>
+      <w:proofErr w:type="gramStart"/>
+      <w:r>
+        <w:rPr>
+          <w:i/>
+          <w:iCs/>
+        </w:rPr>
+        <w:t>calculation</w:t>
       </w:r>
       <w:proofErr w:type="spellEnd"/>
       <w:r>
@@ -4360,7 +4569,15 @@
           <w:i/>
           <w:iCs/>
         </w:rPr>
-        <w:t>()</w:t>
+        <w:t>(</w:t>
+      </w:r>
+      <w:proofErr w:type="gramEnd"/>
+      <w:r>
+        <w:rPr>
+          <w:i/>
+          <w:iCs/>
+        </w:rPr>
+        <w:t>)</w:t>
       </w:r>
       <w:r>
         <w:t xml:space="preserve"> que conserva esos valores</w:t>
@@ -4372,7 +4589,11 @@
         <w:t xml:space="preserve"> </w:t>
       </w:r>
       <w:r>
-        <w:t>La función</w:t>
+        <w:t xml:space="preserve">La </w:t>
+      </w:r>
+      <w:proofErr w:type="gramStart"/>
+      <w:r>
+        <w:t>función</w:t>
       </w:r>
       <w:r>
         <w:t xml:space="preserve"> </w:t>
@@ -4390,9 +4611,9 @@
           <w:szCs w:val="21"/>
           <w:shd w:val="clear" w:color="auto" w:fill="F2F2F2"/>
         </w:rPr>
-        <w:t>new_columns</w:t>
-      </w:r>
-      <w:proofErr w:type="spellEnd"/>
+        <w:t>new</w:t>
+      </w:r>
+      <w:proofErr w:type="gramEnd"/>
       <w:r>
         <w:rPr>
           <w:rFonts w:ascii="Consolas" w:eastAsia="Consolas" w:hAnsi="Consolas" w:cs="Consolas"/>
@@ -4402,7 +4623,43 @@
           <w:szCs w:val="21"/>
           <w:shd w:val="clear" w:color="auto" w:fill="F2F2F2"/>
         </w:rPr>
-        <w:t>()</w:t>
+        <w:t>_</w:t>
+      </w:r>
+      <w:proofErr w:type="gramStart"/>
+      <w:r>
+        <w:rPr>
+          <w:rFonts w:ascii="Consolas" w:eastAsia="Consolas" w:hAnsi="Consolas" w:cs="Consolas"/>
+          <w:i/>
+          <w:iCs/>
+          <w:sz w:val="21"/>
+          <w:szCs w:val="21"/>
+          <w:shd w:val="clear" w:color="auto" w:fill="F2F2F2"/>
+        </w:rPr>
+        <w:t>columns</w:t>
+      </w:r>
+      <w:proofErr w:type="spellEnd"/>
+      <w:r>
+        <w:rPr>
+          <w:rFonts w:ascii="Consolas" w:eastAsia="Consolas" w:hAnsi="Consolas" w:cs="Consolas"/>
+          <w:i/>
+          <w:iCs/>
+          <w:sz w:val="21"/>
+          <w:szCs w:val="21"/>
+          <w:shd w:val="clear" w:color="auto" w:fill="F2F2F2"/>
+        </w:rPr>
+        <w:t>(</w:t>
+      </w:r>
+      <w:proofErr w:type="gramEnd"/>
+      <w:r>
+        <w:rPr>
+          <w:rFonts w:ascii="Consolas" w:eastAsia="Consolas" w:hAnsi="Consolas" w:cs="Consolas"/>
+          <w:i/>
+          <w:iCs/>
+          <w:sz w:val="21"/>
+          <w:szCs w:val="21"/>
+          <w:shd w:val="clear" w:color="auto" w:fill="F2F2F2"/>
+        </w:rPr>
+        <w:t>)</w:t>
       </w:r>
       <w:r>
         <w:t xml:space="preserve"> </w:t>
@@ -4428,6 +4685,7 @@
         <w:t xml:space="preserve">a función </w:t>
       </w:r>
       <w:proofErr w:type="spellStart"/>
+      <w:proofErr w:type="gramStart"/>
       <w:r>
         <w:rPr>
           <w:i/>
@@ -4441,13 +4699,25 @@
           <w:i/>
           <w:iCs/>
         </w:rPr>
-        <w:t>()</w:t>
+        <w:t>(</w:t>
+      </w:r>
+      <w:proofErr w:type="gramEnd"/>
+      <w:r>
+        <w:rPr>
+          <w:i/>
+          <w:iCs/>
+        </w:rPr>
+        <w:t>)</w:t>
       </w:r>
       <w:r>
         <w:t xml:space="preserve"> </w:t>
       </w:r>
       <w:r>
-        <w:t xml:space="preserve">fila a fila con </w:t>
+        <w:t xml:space="preserve">fila a fila </w:t>
+      </w:r>
+      <w:proofErr w:type="gramStart"/>
+      <w:r>
+        <w:t xml:space="preserve">con </w:t>
       </w:r>
       <w:r>
         <w:rPr>
@@ -4467,6 +4737,7 @@
         <w:t>apply</w:t>
       </w:r>
       <w:proofErr w:type="spellEnd"/>
+      <w:proofErr w:type="gramEnd"/>
       <w:r>
         <w:rPr>
           <w:i/>
@@ -4504,11 +4775,16 @@
         <w:t xml:space="preserve">para </w:t>
       </w:r>
       <w:r>
-        <w:t xml:space="preserve">un valor mayor que 1,5 veces </w:t>
+        <w:t xml:space="preserve">un valor mayor que 1,5 </w:t>
+      </w:r>
+      <w:proofErr w:type="gramStart"/>
+      <w:r>
+        <w:t xml:space="preserve">veces </w:t>
       </w:r>
       <w:r>
         <w:t xml:space="preserve"> (</w:t>
       </w:r>
+      <w:proofErr w:type="gramEnd"/>
       <w:r>
         <w:rPr>
           <w:i/>
@@ -4728,6 +5004,7 @@
         <w:t xml:space="preserve">Figura 7. Función </w:t>
       </w:r>
       <w:proofErr w:type="spellStart"/>
+      <w:proofErr w:type="gramStart"/>
       <w:r>
         <w:rPr>
           <w:i/>
@@ -4747,7 +5024,18 @@
           <w:sz w:val="18"/>
           <w:szCs w:val="18"/>
         </w:rPr>
-        <w:t>(): cálculo de umbrales y clasificador interno.</w:t>
+        <w:t>(</w:t>
+      </w:r>
+      <w:proofErr w:type="gramEnd"/>
+      <w:r>
+        <w:rPr>
+          <w:i/>
+          <w:iCs/>
+          <w:color w:val="595959"/>
+          <w:sz w:val="18"/>
+          <w:szCs w:val="18"/>
+        </w:rPr>
+        <w:t>): cálculo de umbrales y clasificador interno.</w:t>
       </w:r>
     </w:p>
     <w:p>
@@ -5022,7 +5310,15 @@
           <w:i/>
           <w:iCs/>
         </w:rPr>
-        <w:t>dataframe_enrichment</w:t>
+        <w:t>dataframe_</w:t>
+      </w:r>
+      <w:proofErr w:type="gramStart"/>
+      <w:r>
+        <w:rPr>
+          <w:i/>
+          <w:iCs/>
+        </w:rPr>
+        <w:t>enrichment</w:t>
       </w:r>
       <w:proofErr w:type="spellEnd"/>
       <w:r>
@@ -5030,7 +5326,15 @@
           <w:i/>
           <w:iCs/>
         </w:rPr>
-        <w:t>()</w:t>
+        <w:t>(</w:t>
+      </w:r>
+      <w:proofErr w:type="gramEnd"/>
+      <w:r>
+        <w:rPr>
+          <w:i/>
+          <w:iCs/>
+        </w:rPr>
+        <w:t>)</w:t>
       </w:r>
       <w:r>
         <w:t xml:space="preserve"> </w:t>
@@ -5053,7 +5357,15 @@
           <w:i/>
           <w:iCs/>
         </w:rPr>
-        <w:t>new_columns</w:t>
+        <w:t>new_</w:t>
+      </w:r>
+      <w:proofErr w:type="gramStart"/>
+      <w:r>
+        <w:rPr>
+          <w:i/>
+          <w:iCs/>
+        </w:rPr>
+        <w:t>columns</w:t>
       </w:r>
       <w:proofErr w:type="spellEnd"/>
       <w:r>
@@ -5061,7 +5373,15 @@
           <w:i/>
           <w:iCs/>
         </w:rPr>
-        <w:t>(),</w:t>
+        <w:t>(</w:t>
+      </w:r>
+      <w:proofErr w:type="gramEnd"/>
+      <w:r>
+        <w:rPr>
+          <w:i/>
+          <w:iCs/>
+        </w:rPr>
+        <w:t>),</w:t>
       </w:r>
       <w:r>
         <w:t xml:space="preserve"> verifica que no haya </w:t>
@@ -5105,7 +5425,15 @@
           <w:i/>
           <w:iCs/>
         </w:rPr>
-        <w:t>drop_imputation_flags</w:t>
+        <w:t>drop_imputation_</w:t>
+      </w:r>
+      <w:proofErr w:type="gramStart"/>
+      <w:r>
+        <w:rPr>
+          <w:i/>
+          <w:iCs/>
+        </w:rPr>
+        <w:t>flags</w:t>
       </w:r>
       <w:proofErr w:type="spellEnd"/>
       <w:r>
@@ -5113,7 +5441,15 @@
           <w:i/>
           <w:iCs/>
         </w:rPr>
-        <w:t>()</w:t>
+        <w:t>(</w:t>
+      </w:r>
+      <w:proofErr w:type="gramEnd"/>
+      <w:r>
+        <w:rPr>
+          <w:i/>
+          <w:iCs/>
+        </w:rPr>
+        <w:t>)</w:t>
       </w:r>
       <w:r>
         <w:rPr>
@@ -5190,7 +5526,15 @@
         <w:t xml:space="preserve">. </w:t>
       </w:r>
       <w:r>
-        <w:t xml:space="preserve">Esto se hizo para que la visualización sea más amigable al usuario y no hubiesen </w:t>
+        <w:t xml:space="preserve">Esto se hizo para que la visualización sea más amigable al usuario y no </w:t>
+      </w:r>
+      <w:proofErr w:type="gramStart"/>
+      <w:r>
+        <w:t>hubiesen</w:t>
+      </w:r>
+      <w:proofErr w:type="gramEnd"/>
+      <w:r>
+        <w:t xml:space="preserve"> </w:t>
       </w:r>
       <w:r>
         <w:t xml:space="preserve">100 </w:t>
@@ -5299,9 +5643,9 @@
           <w:sz w:val="18"/>
           <w:szCs w:val="18"/>
         </w:rPr>
-        <w:t>drop_imputation_flags</w:t>
-      </w:r>
-      <w:proofErr w:type="spellEnd"/>
+        <w:t>drop_imputation_</w:t>
+      </w:r>
+      <w:proofErr w:type="gramStart"/>
       <w:r>
         <w:rPr>
           <w:i/>
@@ -5310,9 +5654,9 @@
           <w:sz w:val="18"/>
           <w:szCs w:val="18"/>
         </w:rPr>
-        <w:t xml:space="preserve">() y </w:t>
-      </w:r>
-      <w:proofErr w:type="spellStart"/>
+        <w:t>flags</w:t>
+      </w:r>
+      <w:proofErr w:type="spellEnd"/>
       <w:r>
         <w:rPr>
           <w:i/>
@@ -5321,9 +5665,9 @@
           <w:sz w:val="18"/>
           <w:szCs w:val="18"/>
         </w:rPr>
-        <w:t>dataframe_enrichment</w:t>
-      </w:r>
-      <w:proofErr w:type="spellEnd"/>
+        <w:t>(</w:t>
+      </w:r>
+      <w:proofErr w:type="gramEnd"/>
       <w:r>
         <w:rPr>
           <w:i/>
@@ -5332,7 +5676,51 @@
           <w:sz w:val="18"/>
           <w:szCs w:val="18"/>
         </w:rPr>
-        <w:t>().</w:t>
+        <w:t xml:space="preserve">) y </w:t>
+      </w:r>
+      <w:proofErr w:type="spellStart"/>
+      <w:r>
+        <w:rPr>
+          <w:i/>
+          <w:iCs/>
+          <w:color w:val="595959"/>
+          <w:sz w:val="18"/>
+          <w:szCs w:val="18"/>
+        </w:rPr>
+        <w:t>dataframe_</w:t>
+      </w:r>
+      <w:proofErr w:type="gramStart"/>
+      <w:r>
+        <w:rPr>
+          <w:i/>
+          <w:iCs/>
+          <w:color w:val="595959"/>
+          <w:sz w:val="18"/>
+          <w:szCs w:val="18"/>
+        </w:rPr>
+        <w:t>enrichment</w:t>
+      </w:r>
+      <w:proofErr w:type="spellEnd"/>
+      <w:r>
+        <w:rPr>
+          <w:i/>
+          <w:iCs/>
+          <w:color w:val="595959"/>
+          <w:sz w:val="18"/>
+          <w:szCs w:val="18"/>
+        </w:rPr>
+        <w:t>(</w:t>
+      </w:r>
+      <w:proofErr w:type="gramEnd"/>
+      <w:r>
+        <w:rPr>
+          <w:i/>
+          <w:iCs/>
+          <w:color w:val="595959"/>
+          <w:sz w:val="18"/>
+          <w:szCs w:val="18"/>
+        </w:rPr>
+        <w:t>).</w:t>
       </w:r>
     </w:p>
     <w:p>
@@ -6376,7 +6764,16 @@
           <w:iCs/>
           <w:lang w:val="es-MX"/>
         </w:rPr>
-        <w:t>check_for_necessary_columns</w:t>
+        <w:t>check_for_necessary_</w:t>
+      </w:r>
+      <w:proofErr w:type="gramStart"/>
+      <w:r>
+        <w:rPr>
+          <w:i/>
+          <w:iCs/>
+          <w:lang w:val="es-MX"/>
+        </w:rPr>
+        <w:t>columns</w:t>
       </w:r>
       <w:proofErr w:type="spellEnd"/>
       <w:r>
@@ -6385,7 +6782,16 @@
           <w:iCs/>
           <w:lang w:val="es-MX"/>
         </w:rPr>
-        <w:t>()</w:t>
+        <w:t>(</w:t>
+      </w:r>
+      <w:proofErr w:type="gramEnd"/>
+      <w:r>
+        <w:rPr>
+          <w:i/>
+          <w:iCs/>
+          <w:lang w:val="es-MX"/>
+        </w:rPr>
+        <w:t>)</w:t>
       </w:r>
       <w:r>
         <w:rPr>
@@ -6426,7 +6832,16 @@
           <w:iCs/>
           <w:lang w:val="es-MX"/>
         </w:rPr>
-        <w:t>is_numeric_dtype</w:t>
+        <w:t>is_numeric_</w:t>
+      </w:r>
+      <w:proofErr w:type="gramStart"/>
+      <w:r>
+        <w:rPr>
+          <w:i/>
+          <w:iCs/>
+          <w:lang w:val="es-MX"/>
+        </w:rPr>
+        <w:t>dtype</w:t>
       </w:r>
       <w:proofErr w:type="spellEnd"/>
       <w:r>
@@ -6435,7 +6850,16 @@
           <w:iCs/>
           <w:lang w:val="es-MX"/>
         </w:rPr>
-        <w:t xml:space="preserve">() </w:t>
+        <w:t>(</w:t>
+      </w:r>
+      <w:proofErr w:type="gramEnd"/>
+      <w:r>
+        <w:rPr>
+          <w:i/>
+          <w:iCs/>
+          <w:lang w:val="es-MX"/>
+        </w:rPr>
+        <w:t xml:space="preserve">) </w:t>
       </w:r>
       <w:r>
         <w:rPr>
@@ -7085,7 +7509,16 @@
           <w:iCs/>
           <w:lang w:val="es-MX"/>
         </w:rPr>
-        <w:t>check_for_necessary_columns</w:t>
+        <w:t>check_for_necessary_</w:t>
+      </w:r>
+      <w:proofErr w:type="gramStart"/>
+      <w:r>
+        <w:rPr>
+          <w:i/>
+          <w:iCs/>
+          <w:lang w:val="es-MX"/>
+        </w:rPr>
+        <w:t>columns</w:t>
       </w:r>
       <w:proofErr w:type="spellEnd"/>
       <w:r>
@@ -7094,7 +7527,16 @@
           <w:iCs/>
           <w:lang w:val="es-MX"/>
         </w:rPr>
-        <w:t>()</w:t>
+        <w:t>(</w:t>
+      </w:r>
+      <w:proofErr w:type="gramEnd"/>
+      <w:r>
+        <w:rPr>
+          <w:i/>
+          <w:iCs/>
+          <w:lang w:val="es-MX"/>
+        </w:rPr>
+        <w:t>)</w:t>
       </w:r>
       <w:r>
         <w:rPr>
@@ -7149,6 +7591,7 @@
         </w:rPr>
         <w:t>is_numeric_</w:t>
       </w:r>
+      <w:proofErr w:type="gramStart"/>
       <w:r>
         <w:rPr>
           <w:i/>
@@ -7164,7 +7607,16 @@
           <w:iCs/>
           <w:lang w:val="es-MX"/>
         </w:rPr>
-        <w:t xml:space="preserve">() </w:t>
+        <w:t>(</w:t>
+      </w:r>
+      <w:proofErr w:type="gramEnd"/>
+      <w:r>
+        <w:rPr>
+          <w:i/>
+          <w:iCs/>
+          <w:lang w:val="es-MX"/>
+        </w:rPr>
+        <w:t xml:space="preserve">) </w:t>
       </w:r>
       <w:r>
         <w:rPr>
@@ -7629,10 +8081,18 @@
         <w:t>es difícil asegurar</w:t>
       </w:r>
       <w:r>
-        <w:t xml:space="preserve"> la relación entre estrato y cumplimiento de pago de IPU </w:t>
-      </w:r>
-      <w:r>
-        <w:t xml:space="preserve"> ya </w:t>
+        <w:t xml:space="preserve"> la relación entre estrato y cumplimiento de pago de </w:t>
+      </w:r>
+      <w:proofErr w:type="gramStart"/>
+      <w:r>
+        <w:t xml:space="preserve">IPU </w:t>
+      </w:r>
+      <w:r>
+        <w:t xml:space="preserve"> ya</w:t>
+      </w:r>
+      <w:proofErr w:type="gramEnd"/>
+      <w:r>
+        <w:t xml:space="preserve"> </w:t>
       </w:r>
       <w:r>
         <w:t xml:space="preserve">que no hay </w:t>
@@ -7832,6 +8292,70 @@
       <w:r>
         <w:t>.</w:t>
       </w:r>
+    </w:p>
+    <w:p>
+      <w:pPr>
+        <w:rPr>
+          <w:b/>
+          <w:bCs/>
+        </w:rPr>
+      </w:pPr>
+      <w:r>
+        <w:br w:type="page"/>
+      </w:r>
+    </w:p>
+    <w:p>
+      <w:pPr>
+        <w:jc w:val="both"/>
+        <w:rPr>
+          <w:b/>
+          <w:bCs/>
+        </w:rPr>
+      </w:pPr>
+    </w:p>
+    <w:p>
+      <w:pPr>
+        <w:jc w:val="both"/>
+        <w:rPr>
+          <w:b/>
+          <w:bCs/>
+        </w:rPr>
+      </w:pPr>
+      <w:r>
+        <w:rPr>
+          <w:b/>
+          <w:bCs/>
+        </w:rPr>
+        <w:t>Enlace al video de presentación</w:t>
+      </w:r>
+    </w:p>
+    <w:p>
+      <w:pPr>
+        <w:jc w:val="both"/>
+        <w:rPr>
+          <w:b/>
+          <w:bCs/>
+        </w:rPr>
+      </w:pPr>
+      <w:hyperlink r:id="rId35" w:history="1">
+        <w:r>
+          <w:rPr>
+            <w:rStyle w:val="Hipervnculo"/>
+            <w:b/>
+            <w:bCs/>
+          </w:rPr>
+          <w:t>Video_presentación_impuesto_predial.mp4</w:t>
+        </w:r>
+      </w:hyperlink>
+    </w:p>
+    <w:p>
+      <w:pPr>
+        <w:jc w:val="both"/>
+        <w:rPr>
+          <w:b/>
+          <w:bCs/>
+        </w:rPr>
+      </w:pPr>
     </w:p>
     <w:sectPr>
       <w:pgSz w:w="12240" w:h="15840"/>
@@ -9874,7 +10398,6 @@
   <w:style w:type="character" w:default="1" w:styleId="Fuentedeprrafopredeter">
     <w:name w:val="Default Paragraph Font"/>
     <w:uiPriority w:val="1"/>
-    <w:semiHidden/>
     <w:unhideWhenUsed/>
   </w:style>
   <w:style w:type="table" w:default="1" w:styleId="Tablanormal">
@@ -10651,15 +11174,6 @@
 </file>
 
 <file path=customXml/item1.xml><?xml version="1.0" encoding="utf-8"?>
-<?mso-contentType ?>
-<FormTemplates xmlns="http://schemas.microsoft.com/sharepoint/v3/contenttype/forms">
-  <Display>DocumentLibraryForm</Display>
-  <Edit>DocumentLibraryForm</Edit>
-  <New>DocumentLibraryForm</New>
-</FormTemplates>
-</file>
-
-<file path=customXml/item2.xml><?xml version="1.0" encoding="utf-8"?>
 <ct:contentTypeSchema xmlns:ct="http://schemas.microsoft.com/office/2006/metadata/contentType" xmlns:ma="http://schemas.microsoft.com/office/2006/metadata/properties/metaAttributes" ct:_="" ma:_="" ma:contentTypeName="Documento" ma:contentTypeID="0x010100768DAC1AD940BD4E95A4D40C6C41D4BC" ma:contentTypeVersion="14" ma:contentTypeDescription="Crear nuevo documento." ma:contentTypeScope="" ma:versionID="4caf8888feb2af327696d7825c93e00c">
   <xsd:schema xmlns:xsd="http://www.w3.org/2001/XMLSchema" xmlns:xs="http://www.w3.org/2001/XMLSchema" xmlns:p="http://schemas.microsoft.com/office/2006/metadata/properties" xmlns:ns3="c00592bb-d6db-4c45-a7f4-7f8c677b85ee" xmlns:ns4="5cdebb82-32c3-490a-81f2-dcb8502ef570" targetNamespace="http://schemas.microsoft.com/office/2006/metadata/properties" ma:root="true" ma:fieldsID="41f77744a5f031ffdeb2344cff826688" ns3:_="" ns4:_="">
     <xsd:import namespace="c00592bb-d6db-4c45-a7f4-7f8c677b85ee"/>
@@ -10886,11 +11400,16 @@
 </ct:contentTypeSchema>
 </file>
 
-<file path=customXml/item3.xml><?xml version="1.0" encoding="utf-8"?>
-<b:Sources xmlns:b="http://schemas.openxmlformats.org/officeDocument/2006/bibliography" xmlns="http://schemas.openxmlformats.org/officeDocument/2006/bibliography" SelectedStyle="\APASixthEditionOfficeOnline.xsl" StyleName="APA" Version="6"/>
+<file path=customXml/item2.xml><?xml version="1.0" encoding="utf-8"?>
+<?mso-contentType ?>
+<FormTemplates xmlns="http://schemas.microsoft.com/sharepoint/v3/contenttype/forms">
+  <Display>DocumentLibraryForm</Display>
+  <Edit>DocumentLibraryForm</Edit>
+  <New>DocumentLibraryForm</New>
+</FormTemplates>
 </file>
 
-<file path=customXml/item4.xml><?xml version="1.0" encoding="utf-8"?>
+<file path=customXml/item3.xml><?xml version="1.0" encoding="utf-8"?>
 <p:properties xmlns:p="http://schemas.microsoft.com/office/2006/metadata/properties" xmlns:xsi="http://www.w3.org/2001/XMLSchema-instance" xmlns:pc="http://schemas.microsoft.com/office/infopath/2007/PartnerControls">
   <documentManagement>
     <_activity xmlns="5cdebb82-32c3-490a-81f2-dcb8502ef570" xsi:nil="true"/>
@@ -10898,15 +11417,11 @@
 </p:properties>
 </file>
 
-<file path=customXml/itemProps1.xml><?xml version="1.0" encoding="utf-8"?>
-<ds:datastoreItem xmlns:ds="http://schemas.openxmlformats.org/officeDocument/2006/customXml" ds:itemID="{D7D84234-BA74-41D1-9B23-F9F7EEB21525}">
-  <ds:schemaRefs>
-    <ds:schemaRef ds:uri="http://schemas.microsoft.com/sharepoint/v3/contenttype/forms"/>
-  </ds:schemaRefs>
-</ds:datastoreItem>
+<file path=customXml/item4.xml><?xml version="1.0" encoding="utf-8"?>
+<b:Sources xmlns:b="http://schemas.openxmlformats.org/officeDocument/2006/bibliography" xmlns="http://schemas.openxmlformats.org/officeDocument/2006/bibliography" SelectedStyle="\APASixthEditionOfficeOnline.xsl" StyleName="APA" Version="6"/>
 </file>
 
-<file path=customXml/itemProps2.xml><?xml version="1.0" encoding="utf-8"?>
+<file path=customXml/itemProps1.xml><?xml version="1.0" encoding="utf-8"?>
 <ds:datastoreItem xmlns:ds="http://schemas.openxmlformats.org/officeDocument/2006/customXml" ds:itemID="{E7C02CF1-7228-41BA-A1A2-C00AF110A6D1}">
   <ds:schemaRefs>
     <ds:schemaRef ds:uri="http://schemas.microsoft.com/office/2006/metadata/contentType"/>
@@ -10925,15 +11440,15 @@
 </ds:datastoreItem>
 </file>
 
-<file path=customXml/itemProps3.xml><?xml version="1.0" encoding="utf-8"?>
-<ds:datastoreItem xmlns:ds="http://schemas.openxmlformats.org/officeDocument/2006/customXml" ds:itemID="{328C50CC-181B-4E15-BBB5-21C1A192EC66}">
+<file path=customXml/itemProps2.xml><?xml version="1.0" encoding="utf-8"?>
+<ds:datastoreItem xmlns:ds="http://schemas.openxmlformats.org/officeDocument/2006/customXml" ds:itemID="{D7D84234-BA74-41D1-9B23-F9F7EEB21525}">
   <ds:schemaRefs>
-    <ds:schemaRef ds:uri="http://schemas.openxmlformats.org/officeDocument/2006/bibliography"/>
+    <ds:schemaRef ds:uri="http://schemas.microsoft.com/sharepoint/v3/contenttype/forms"/>
   </ds:schemaRefs>
 </ds:datastoreItem>
 </file>
 
-<file path=customXml/itemProps4.xml><?xml version="1.0" encoding="utf-8"?>
+<file path=customXml/itemProps3.xml><?xml version="1.0" encoding="utf-8"?>
 <ds:datastoreItem xmlns:ds="http://schemas.openxmlformats.org/officeDocument/2006/customXml" ds:itemID="{5A131DF8-ABA8-47F6-906A-48C85DE5B79A}">
   <ds:schemaRefs>
     <ds:schemaRef ds:uri="http://schemas.microsoft.com/office/2006/metadata/properties"/>
@@ -10941,4 +11456,12 @@
     <ds:schemaRef ds:uri="5cdebb82-32c3-490a-81f2-dcb8502ef570"/>
   </ds:schemaRefs>
 </ds:datastoreItem>
+</file>
+
+<file path=customXml/itemProps4.xml><?xml version="1.0" encoding="utf-8"?>
+<ds:datastoreItem xmlns:ds="http://schemas.openxmlformats.org/officeDocument/2006/customXml" ds:itemID="{328C50CC-181B-4E15-BBB5-21C1A192EC66}">
+  <ds:schemaRefs>
+    <ds:schemaRef ds:uri="http://schemas.openxmlformats.org/officeDocument/2006/bibliography"/>
+  </ds:schemaRefs>
+</ds:datastoreItem>
 </file>
</xml_diff>